<commit_message>
Update overview doc with the 'cost of not using LTS' comparison
Document the new value-comparison feature (manual cost vs LTS, savings in
rands and staff hours) and add a next-step to agree its default assumptions.

Co-Authored-By: Claude Opus 4.8 <noreply@anthropic.com>
Claude-Session: https://claude.ai/code/session_01MyzjcWcaYPLNWygDxYahJu
</commit_message>
<xml_diff>
--- a/dist/LTS-Pricing-Calculator-Overview.docx
+++ b/dist/LTS-Pricing-Calculator-Overview.docx
@@ -342,6 +342,155 @@
           <w:szCs w:val="21"/>
         </w:rPr>
         <w:t xml:space="preserve">A short “loading” animation (like the Azure calculator) plays when opening an estimate.</w:t>
+      </w:r>
+    </w:p>
+    <w:p>
+      <w:pPr>
+        <w:pStyle w:val="ListParagraph"/>
+        <w:numPr>
+          <w:ilvl w:val="0"/>
+          <w:numId w:val="2"/>
+        </w:numPr>
+        <w:spacing w:after="60"/>
+      </w:pPr>
+      <w:r>
+        <w:rPr>
+          <w:color w:val="222833"/>
+          <w:sz w:val="21"/>
+          <w:szCs w:val="21"/>
+        </w:rPr>
+        <w:t xml:space="preserve">Shows the “cost of NOT using LTS” — the time and money of doing the same admin by hand — next to the LTS cost (see below).</w:t>
+      </w:r>
+    </w:p>
+    <w:p>
+      <w:pPr>
+        <w:pStyle w:val="Heading1"/>
+        <w:spacing w:after="120" w:before="260"/>
+      </w:pPr>
+      <w:r>
+        <w:rPr>
+          <w:b/>
+          <w:bCs/>
+          <w:color w:val="1A2AE6"/>
+          <w:sz w:val="28"/>
+          <w:szCs w:val="28"/>
+        </w:rPr>
+        <w:t xml:space="preserve">Showing the value — the cost of not using LTS</w:t>
+      </w:r>
+    </w:p>
+    <w:p>
+      <w:pPr>
+        <w:spacing w:after="120"/>
+      </w:pPr>
+      <w:r>
+        <w:rPr>
+          <w:color w:val="222833"/>
+          <w:sz w:val="21"/>
+          <w:szCs w:val="21"/>
+        </w:rPr>
+        <w:t xml:space="preserve">A new section lets the customer see, in rands </w:t>
+      </w:r>
+      <w:r>
+        <w:rPr>
+          <w:i/>
+          <w:iCs/>
+          <w:color w:val="222833"/>
+          <w:sz w:val="21"/>
+          <w:szCs w:val="21"/>
+        </w:rPr>
+        <w:t xml:space="preserve">and</w:t>
+      </w:r>
+      <w:r>
+        <w:rPr>
+          <w:color w:val="222833"/>
+          <w:sz w:val="21"/>
+          <w:szCs w:val="21"/>
+        </w:rPr>
+        <w:t xml:space="preserve"> in hours, what it costs them to keep running the same admin manually — and how much LTS hands back:</w:t>
+      </w:r>
+    </w:p>
+    <w:p>
+      <w:pPr>
+        <w:pStyle w:val="ListParagraph"/>
+        <w:numPr>
+          <w:ilvl w:val="0"/>
+          <w:numId w:val="2"/>
+        </w:numPr>
+        <w:spacing w:after="60"/>
+      </w:pPr>
+      <w:r>
+        <w:rPr>
+          <w:b/>
+          <w:bCs/>
+          <w:color w:val="101B33"/>
+          <w:sz w:val="21"/>
+          <w:szCs w:val="21"/>
+        </w:rPr>
+        <w:t xml:space="preserve">By hand: </w:t>
+      </w:r>
+      <w:r>
+        <w:rPr>
+          <w:color w:val="222833"/>
+          <w:sz w:val="21"/>
+          <w:szCs w:val="21"/>
+        </w:rPr>
+        <w:t xml:space="preserve">Estimates the manual cost: staff time (hours × hourly rate) plus paper, printing and storage, for their trainee count.</w:t>
+      </w:r>
+    </w:p>
+    <w:p>
+      <w:pPr>
+        <w:pStyle w:val="ListParagraph"/>
+        <w:numPr>
+          <w:ilvl w:val="0"/>
+          <w:numId w:val="2"/>
+        </w:numPr>
+        <w:spacing w:after="60"/>
+      </w:pPr>
+      <w:r>
+        <w:rPr>
+          <w:b/>
+          <w:bCs/>
+          <w:color w:val="101B33"/>
+          <w:sz w:val="21"/>
+          <w:szCs w:val="21"/>
+        </w:rPr>
+        <w:t xml:space="preserve">Side by side: </w:t>
+      </w:r>
+      <w:r>
+        <w:rPr>
+          <w:color w:val="222833"/>
+          <w:sz w:val="21"/>
+          <w:szCs w:val="21"/>
+        </w:rPr>
+        <w:t xml:space="preserve">Puts that side by side with their chosen LTS plan, and shows the saving per month and per year, plus the staff hours freed up each month.</w:t>
+      </w:r>
+    </w:p>
+    <w:p>
+      <w:pPr>
+        <w:pStyle w:val="ListParagraph"/>
+        <w:numPr>
+          <w:ilvl w:val="0"/>
+          <w:numId w:val="2"/>
+        </w:numPr>
+        <w:spacing w:after="60"/>
+      </w:pPr>
+      <w:r>
+        <w:rPr>
+          <w:b/>
+          <w:bCs/>
+          <w:color w:val="101B33"/>
+          <w:sz w:val="21"/>
+          <w:szCs w:val="21"/>
+        </w:rPr>
+        <w:t xml:space="preserve">Their numbers: </w:t>
+      </w:r>
+      <w:r>
+        <w:rPr>
+          <w:color w:val="222833"/>
+          <w:sz w:val="21"/>
+          <w:szCs w:val="21"/>
+        </w:rPr>
+        <w:t xml:space="preserve">The customer adjusts the assumptions (hours, hourly rate, materials) to match their own office — so the numbers are theirs, not ours, which keeps it credible.</w:t>
       </w:r>
     </w:p>
     <w:p>
@@ -1016,6 +1165,34 @@
           <w:sz w:val="21"/>
           <w:szCs w:val="21"/>
         </w:rPr>
+        <w:t xml:space="preserve">Comparison defaults: </w:t>
+      </w:r>
+      <w:r>
+        <w:rPr>
+          <w:color w:val="222833"/>
+          <w:sz w:val="21"/>
+          <w:szCs w:val="21"/>
+        </w:rPr>
+        <w:t xml:space="preserve">Agree sensible default assumptions for the “cost of not using LTS” comparison (hours per trainee, hourly rate, materials).</w:t>
+      </w:r>
+    </w:p>
+    <w:p>
+      <w:pPr>
+        <w:pStyle w:val="ListParagraph"/>
+        <w:numPr>
+          <w:ilvl w:val="0"/>
+          <w:numId w:val="2"/>
+        </w:numPr>
+        <w:spacing w:after="60"/>
+      </w:pPr>
+      <w:r>
+        <w:rPr>
+          <w:b/>
+          <w:bCs/>
+          <w:color w:val="101B33"/>
+          <w:sz w:val="21"/>
+          <w:szCs w:val="21"/>
+        </w:rPr>
         <w:t xml:space="preserve">Hosting: </w:t>
       </w:r>
       <w:r>

</xml_diff>